<commit_message>
Added figs at the end of W2 + tidy up of repo removing 2024 admin stuff
</commit_message>
<xml_diff>
--- a/Workshops/Workshop 2 - Data vis/Workshop-2---Data-visualisation--with-answers-.docx
+++ b/Workshops/Workshop 2 - Data vis/Workshop-2---Data-visualisation--with-answers-.docx
@@ -111,11 +111,11 @@
     </w:p>
     <w:p>
       <w:pPr>
-        <w:pStyle w:val="Compact"/>
         <w:numPr>
           <w:ilvl w:val="0"/>
           <w:numId w:val="1001"/>
         </w:numPr>
+        <w:pStyle w:val="Compact"/>
       </w:pPr>
       <w:r>
         <w:t xml:space="preserve">Formulate a research question.</w:t>
@@ -123,11 +123,11 @@
     </w:p>
     <w:p>
       <w:pPr>
-        <w:pStyle w:val="Compact"/>
         <w:numPr>
           <w:ilvl w:val="0"/>
           <w:numId w:val="1001"/>
         </w:numPr>
+        <w:pStyle w:val="Compact"/>
       </w:pPr>
       <w:r>
         <w:t xml:space="preserve">Perform exploratory data analysis [Focus of today].</w:t>
@@ -135,11 +135,11 @@
     </w:p>
     <w:p>
       <w:pPr>
-        <w:pStyle w:val="Compact"/>
         <w:numPr>
           <w:ilvl w:val="0"/>
           <w:numId w:val="1001"/>
         </w:numPr>
+        <w:pStyle w:val="Compact"/>
       </w:pPr>
       <w:r>
         <w:t xml:space="preserve">Identify any hidden assumptions [Focus of today].</w:t>
@@ -147,11 +147,11 @@
     </w:p>
     <w:p>
       <w:pPr>
-        <w:pStyle w:val="Compact"/>
         <w:numPr>
           <w:ilvl w:val="0"/>
           <w:numId w:val="1001"/>
         </w:numPr>
+        <w:pStyle w:val="Compact"/>
       </w:pPr>
       <w:r>
         <w:t xml:space="preserve">Fit an appropriate model.</w:t>
@@ -159,11 +159,11 @@
     </w:p>
     <w:p>
       <w:pPr>
-        <w:pStyle w:val="Compact"/>
         <w:numPr>
           <w:ilvl w:val="0"/>
           <w:numId w:val="1001"/>
         </w:numPr>
+        <w:pStyle w:val="Compact"/>
       </w:pPr>
       <w:r>
         <w:t xml:space="preserve">Diagnose the model and check assumptions.</w:t>
@@ -171,11 +171,11 @@
     </w:p>
     <w:p>
       <w:pPr>
-        <w:pStyle w:val="Compact"/>
         <w:numPr>
           <w:ilvl w:val="0"/>
           <w:numId w:val="1001"/>
         </w:numPr>
+        <w:pStyle w:val="Compact"/>
       </w:pPr>
       <w:r>
         <w:t xml:space="preserve">Summarise the results.</w:t>
@@ -183,11 +183,11 @@
     </w:p>
     <w:p>
       <w:pPr>
-        <w:pStyle w:val="Compact"/>
         <w:numPr>
           <w:ilvl w:val="0"/>
           <w:numId w:val="1001"/>
         </w:numPr>
+        <w:pStyle w:val="Compact"/>
       </w:pPr>
       <w:r>
         <w:t xml:space="preserve">Interpret and provide inferences.</w:t>
@@ -213,11 +213,11 @@
     </w:p>
     <w:p>
       <w:pPr>
-        <w:pStyle w:val="Compact"/>
         <w:numPr>
           <w:ilvl w:val="0"/>
           <w:numId w:val="1002"/>
         </w:numPr>
+        <w:pStyle w:val="Compact"/>
       </w:pPr>
       <w:r>
         <w:t xml:space="preserve">Learn how to use the</w:t>
@@ -255,11 +255,11 @@
     </w:p>
     <w:p>
       <w:pPr>
-        <w:pStyle w:val="Compact"/>
         <w:numPr>
           <w:ilvl w:val="0"/>
           <w:numId w:val="1002"/>
         </w:numPr>
+        <w:pStyle w:val="Compact"/>
       </w:pPr>
       <w:r>
         <w:t xml:space="preserve">Consider what constitutes an effective visualisation versus an ineffective one.</w:t>
@@ -267,11 +267,11 @@
     </w:p>
     <w:p>
       <w:pPr>
-        <w:pStyle w:val="Compact"/>
         <w:numPr>
           <w:ilvl w:val="0"/>
           <w:numId w:val="1002"/>
         </w:numPr>
+        <w:pStyle w:val="Compact"/>
       </w:pPr>
       <w:r>
         <w:t xml:space="preserve">Learn some techniques to make your figures more visually appealing to an audience.</w:t>
@@ -434,24 +434,24 @@
       </w:r>
       <w:r>
         <w:rPr>
+          <w:iCs/>
           <w:i/>
+        </w:rPr>
+        <w:t xml:space="preserve">Inia geoffrensis</w:t>
+      </w:r>
+      <w:r>
+        <w:t xml:space="preserve"> </w:t>
+      </w:r>
+      <w:r>
+        <w:t xml:space="preserve">- I wonder if the person who named the species had a friend called Geoff…). For this first interaction with this data, we’ll broadly say that we’re interested in seeing if there is sexual dimorphism in asymptotic length (i.e. once an animal has stopped growing) between females and males, as well as how the species respond to droughts. As always, before we do any analysis, we need to ensure there is nothing</w:t>
+      </w:r>
+      <w:r>
+        <w:t xml:space="preserve"> </w:t>
+      </w:r>
+      <w:r>
+        <w:rPr>
           <w:iCs/>
-        </w:rPr>
-        <w:t xml:space="preserve">Inia geoffrensis</w:t>
-      </w:r>
-      <w:r>
-        <w:t xml:space="preserve"> </w:t>
-      </w:r>
-      <w:r>
-        <w:t xml:space="preserve">- I wonder if the person who named the species had a friend called Geoff…). For this first interaction with this data, we’ll broadly say that we’re interested in seeing if there is sexual dimorphism in asymptotic length (i.e. once an animal has stopped growing) between females and males, as well as how the species respond to droughts. As always, before we do any analysis, we need to ensure there is nothing</w:t>
-      </w:r>
-      <w:r>
-        <w:t xml:space="preserve"> </w:t>
-      </w:r>
-      <w:r>
-        <w:rPr>
           <w:i/>
-          <w:iCs/>
         </w:rPr>
         <w:t xml:space="preserve">weird</w:t>
       </w:r>
@@ -2352,8 +2352,8 @@
       </w:r>
       <w:r>
         <w:rPr>
+          <w:iCs/>
           <w:i/>
-          <w:iCs/>
         </w:rPr>
         <w:t xml:space="preserve">under</w:t>
       </w:r>
@@ -4742,8 +4742,8 @@
       </w:r>
       <w:r>
         <w:rPr>
+          <w:iCs/>
           <w:i/>
-          <w:iCs/>
         </w:rPr>
         <w:t xml:space="preserve">weird</w:t>
       </w:r>
@@ -5073,7 +5073,7 @@
         <w:pStyle w:val="BodyText"/>
       </w:pPr>
       <w:r>
-        <w:t xml:space="preserve">Create a histogram using the boto length data (you did this in Question Set Two, Question 4). We can improve the appearance of the graph by adding outlines to the bars, adding labels for the axes. Initially, do not separate the male and female dolphins.</w:t>
+        <w:t xml:space="preserve">Create a histogram using the boto length data (you did this in Question Set Two, Question 4). We can improve the appearance of the graph by adding outlines to the bars, adding labels for the axes.</w:t>
       </w:r>
     </w:p>
     <w:p>
@@ -5767,19 +5767,7 @@
         <w:t xml:space="preserve"> </w:t>
       </w:r>
       <w:r>
-        <w:t xml:space="preserve">as histograms, in that they’re very useful for understanding the spread of your data. In truth, they’re exceptionally similar to histograms but differ in two important ways:</w:t>
-      </w:r>
-      <w:r>
-        <w:t xml:space="preserve"> </w:t>
-      </w:r>
-      <w:r>
-        <w:t xml:space="preserve">1. The y-axis doesn’t show counts but proportion (i.e. what proportion of observations are in at this value)</w:t>
-      </w:r>
-      <w:r>
-        <w:t xml:space="preserve"> </w:t>
-      </w:r>
-      <w:r>
-        <w:t xml:space="preserve">2. They don’t use bins and bars, but instead use a smoothed line</w:t>
+        <w:t xml:space="preserve">as histograms, in that they’re very useful for understanding the spread of your data. In truth, they’re exceptionally similar to histograms but differ in two important ways: 1. The y-axis doesn’t show counts but proportion (i.e. what proportion of observations are in at this value) 2. They don’t use bins and bars, but instead use a smoothed line</w:t>
       </w:r>
     </w:p>
     <w:p>
@@ -6381,6 +6369,14 @@
         </w:drawing>
       </w:r>
     </w:p>
+    <w:p>
+      <w:pPr>
+        <w:pStyle w:val="BodyText"/>
+      </w:pPr>
+      <w:r>
+        <w:t xml:space="preserve">Remember those violin plots from earlier? They’re basically just density plots rotated onto their side and split by whichever factor you add to the x-axis.</w:t>
+      </w:r>
+    </w:p>
     <w:bookmarkEnd w:id="81"/>
     <w:bookmarkEnd w:id="82"/>
     <w:bookmarkStart w:id="96" w:name="the-good-and-the-bad"/>
@@ -6633,8 +6629,8 @@
       </w:r>
       <w:r>
         <w:rPr>
+          <w:iCs/>
           <w:i/>
-          <w:iCs/>
         </w:rPr>
         <w:t xml:space="preserve">added to the dataset</w:t>
       </w:r>
@@ -6771,8 +6767,8 @@
       </w:r>
       <w:r>
         <w:rPr>
+          <w:iCs/>
           <w:i/>
-          <w:iCs/>
         </w:rPr>
         <w:t xml:space="preserve">long</w:t>
       </w:r>
@@ -6959,24 +6955,24 @@
       </w:r>
       <w:r>
         <w:rPr>
+          <w:iCs/>
           <w:i/>
+        </w:rPr>
+        <w:t xml:space="preserve">original</w:t>
+      </w:r>
+      <w:r>
+        <w:t xml:space="preserve"> </w:t>
+      </w:r>
+      <w:r>
+        <w:t xml:space="preserve">data because of the web link! We’ll come back to this dataset later in the course where you’ll be using it to predict how much rent a landlord</w:t>
+      </w:r>
+      <w:r>
+        <w:t xml:space="preserve"> </w:t>
+      </w:r>
+      <w:r>
+        <w:rPr>
           <w:iCs/>
-        </w:rPr>
-        <w:t xml:space="preserve">original</w:t>
-      </w:r>
-      <w:r>
-        <w:t xml:space="preserve"> </w:t>
-      </w:r>
-      <w:r>
-        <w:t xml:space="preserve">data because of the web link! We’ll come back to this dataset later in the course where you’ll be using it to predict how much rent a landlord</w:t>
-      </w:r>
-      <w:r>
-        <w:t xml:space="preserve"> </w:t>
-      </w:r>
-      <w:r>
-        <w:rPr>
           <w:i/>
-          <w:iCs/>
         </w:rPr>
         <w:t xml:space="preserve">should</w:t>
       </w:r>
@@ -7377,7 +7373,7 @@
         <w:rPr>
           <w:rStyle w:val="DecValTok"/>
         </w:rPr>
-        <w:t xml:space="preserve">50</w:t>
+        <w:t xml:space="preserve">25</w:t>
       </w:r>
       <w:r>
         <w:rPr>
@@ -10165,73 +10161,73 @@
       </w:r>
       <w:r>
         <w:rPr>
+          <w:iCs/>
           <w:i/>
+        </w:rPr>
+        <w:t xml:space="preserve">contain</w:t>
+      </w:r>
+      <w:r>
+        <w:t xml:space="preserve"> </w:t>
+      </w:r>
+      <w:r>
+        <w:t xml:space="preserve">the information (i.e. no blank figures) and be</w:t>
+      </w:r>
+      <w:r>
+        <w:t xml:space="preserve"> </w:t>
+      </w:r>
+      <w:r>
+        <w:rPr>
           <w:iCs/>
-        </w:rPr>
-        <w:t xml:space="preserve">contain</w:t>
-      </w:r>
-      <w:r>
-        <w:t xml:space="preserve"> </w:t>
-      </w:r>
-      <w:r>
-        <w:t xml:space="preserve">the information (i.e. no blank figures) and be</w:t>
-      </w:r>
-      <w:r>
-        <w:t xml:space="preserve"> </w:t>
-      </w:r>
-      <w:r>
-        <w:rPr>
           <w:i/>
+        </w:rPr>
+        <w:t xml:space="preserve">somewhat</w:t>
+      </w:r>
+      <w:r>
+        <w:t xml:space="preserve"> </w:t>
+      </w:r>
+      <w:r>
+        <w:t xml:space="preserve">readable. If you need inspiration, search for</w:t>
+      </w:r>
+      <w:r>
+        <w:t xml:space="preserve"> </w:t>
+      </w:r>
+      <w:r>
+        <w:t xml:space="preserve">“</w:t>
+      </w:r>
+      <w:r>
+        <w:t xml:space="preserve">graph crimes</w:t>
+      </w:r>
+      <w:r>
+        <w:t xml:space="preserve">”</w:t>
+      </w:r>
+      <w:r>
+        <w:t xml:space="preserve">, or</w:t>
+      </w:r>
+      <w:r>
+        <w:t xml:space="preserve"> </w:t>
+      </w:r>
+      <w:r>
+        <w:t xml:space="preserve">“</w:t>
+      </w:r>
+      <w:r>
+        <w:t xml:space="preserve">chart crimes</w:t>
+      </w:r>
+      <w:r>
+        <w:t xml:space="preserve">”</w:t>
+      </w:r>
+      <w:r>
+        <w:t xml:space="preserve"> </w:t>
+      </w:r>
+      <w:r>
+        <w:t xml:space="preserve">in your search engine - there are</w:t>
+      </w:r>
+      <w:r>
+        <w:t xml:space="preserve"> </w:t>
+      </w:r>
+      <w:r>
+        <w:rPr>
           <w:iCs/>
-        </w:rPr>
-        <w:t xml:space="preserve">somewhat</w:t>
-      </w:r>
-      <w:r>
-        <w:t xml:space="preserve"> </w:t>
-      </w:r>
-      <w:r>
-        <w:t xml:space="preserve">readable. If you need inspiration, search for</w:t>
-      </w:r>
-      <w:r>
-        <w:t xml:space="preserve"> </w:t>
-      </w:r>
-      <w:r>
-        <w:t xml:space="preserve">“</w:t>
-      </w:r>
-      <w:r>
-        <w:t xml:space="preserve">graph crimes</w:t>
-      </w:r>
-      <w:r>
-        <w:t xml:space="preserve">”</w:t>
-      </w:r>
-      <w:r>
-        <w:t xml:space="preserve">, or</w:t>
-      </w:r>
-      <w:r>
-        <w:t xml:space="preserve"> </w:t>
-      </w:r>
-      <w:r>
-        <w:t xml:space="preserve">“</w:t>
-      </w:r>
-      <w:r>
-        <w:t xml:space="preserve">chart crimes</w:t>
-      </w:r>
-      <w:r>
-        <w:t xml:space="preserve">”</w:t>
-      </w:r>
-      <w:r>
-        <w:t xml:space="preserve"> </w:t>
-      </w:r>
-      <w:r>
-        <w:t xml:space="preserve">in your search engine - there are</w:t>
-      </w:r>
-      <w:r>
-        <w:t xml:space="preserve"> </w:t>
-      </w:r>
-      <w:r>
-        <w:rPr>
           <w:i/>
-          <w:iCs/>
         </w:rPr>
         <w:t xml:space="preserve">lots</w:t>
       </w:r>
@@ -12015,7 +12011,7 @@
     </w:p>
     <w:bookmarkEnd w:id="95"/>
     <w:bookmarkEnd w:id="96"/>
-    <w:bookmarkStart w:id="101" w:name="figures-from-the-real-world"/>
+    <w:bookmarkStart w:id="113" w:name="figures-from-the-real-world"/>
     <w:p>
       <w:pPr>
         <w:pStyle w:val="Heading1"/>
@@ -12059,25 +12055,25 @@
         <w:t xml:space="preserve">.</w:t>
       </w:r>
     </w:p>
-    <w:bookmarkStart w:id="100" w:name="financial-times-london-buses"/>
+    <w:bookmarkStart w:id="100" w:name="the-y-axis1"/>
     <w:p>
       <w:pPr>
         <w:pStyle w:val="Heading2"/>
       </w:pPr>
       <w:r>
-        <w:t xml:space="preserve">Financial Times: London Buses</w:t>
-      </w:r>
-    </w:p>
-    <w:p>
-      <w:pPr>
-        <w:pStyle w:val="CaptionedFigure"/>
+        <w:t xml:space="preserve">THe Y-AxIs!1!</w:t>
+      </w:r>
+    </w:p>
+    <w:p>
+      <w:pPr>
+        <w:pStyle w:val="FirstParagraph"/>
       </w:pPr>
       <w:r>
         <w:drawing>
           <wp:inline>
             <wp:extent cx="3810000" cy="5755640"/>
             <wp:effectExtent b="0" l="0" r="0" t="0"/>
-            <wp:docPr descr="Caption" title="" id="98" name="Picture"/>
+            <wp:docPr descr="" title="" id="98" name="Picture"/>
             <a:graphic>
               <a:graphicData uri="http://schemas.openxmlformats.org/drawingml/2006/picture">
                 <pic:pic>
@@ -12117,21 +12113,16 @@
     </w:p>
     <w:p>
       <w:pPr>
-        <w:pStyle w:val="ImageCaption"/>
-      </w:pPr>
-      <w:r>
-        <w:t xml:space="preserve">Caption</w:t>
-      </w:r>
-    </w:p>
-    <w:p>
-      <w:pPr>
         <w:pStyle w:val="SourceCode"/>
       </w:pPr>
       <w:r>
         <w:rPr>
           <w:rStyle w:val="CommentTok"/>
         </w:rPr>
-        <w:t xml:space="preserve"># This figure made a lot of people really angry on line, mostly due to the y-axis. Note how it the y-axis ranges from -50% to +100%? That's because the values have been logged transformed, which people argued made it exaggerate the differences.</w:t>
+        <w:t xml:space="preserve"># This figure made a lot of people really angry online, mostly due to the y-axis. Note how the y-axis ranges from -50% to +100%? That's because the values have been logged transformed, which people argued made it exaggerate the differences.</w:t>
+      </w:r>
+      <w:r>
+        <w:br/>
       </w:r>
       <w:r>
         <w:br/>
@@ -12140,7 +12131,7 @@
         <w:rPr>
           <w:rStyle w:val="CommentTok"/>
         </w:rPr>
-        <w:t xml:space="preserve"># In truth, it's actually a pretty clever y-axis. 100% represents a doubling in the number of buses; Increasing the number of buses from 5 to 10 is a 100% increase - the number has doubled. Going from 10 to 5, however, is a -50% decrease - the number has halved.</w:t>
+        <w:t xml:space="preserve"># In truth, it's actually a pretty clever y-axis. 100% represents a doubling in the number of buses; Increasing the number of buses from 5 to 10 is a 100% increase - the number has doubled. Going from 10 to 5, however, is a -50% decrease - the number has halved. Doing it this way makes your natural interpretation of the lines appropriate. Had they not made this change the figure *would have exaggerated* the apparent (lack of) difference.</w:t>
       </w:r>
       <w:r>
         <w:br/>
@@ -12152,11 +12143,401 @@
         <w:rPr>
           <w:rStyle w:val="CommentTok"/>
         </w:rPr>
-        <w:t xml:space="preserve"># People get super agitated by y-axes, especially when the bottom is not set to zero. Honestly? I don't care. There are times when it's entirely appropriate to do that, other times when it's not. But I really dislike when people seem to treat it as the *rule* is that there is only ever a singularly correct way to set up a figure.</w:t>
+        <w:t xml:space="preserve"># People get super annoyed by y-axes, especially when the bottom is not set to zero. Honestly? I don't care. There are times when it's entirely appropriate to do that, other times when it's not. But I dislike it when people treat it as though there is some *rule* that there is only a singularly correct way to set up a figures axes. There's not. Use your brain. Think what the best way is to visualise your data and do that.</w:t>
+      </w:r>
+      <w:r>
+        <w:br/>
+      </w:r>
+      <w:r>
+        <w:br/>
+      </w:r>
+      <w:r>
+        <w:rPr>
+          <w:rStyle w:val="CommentTok"/>
+        </w:rPr>
+        <w:t xml:space="preserve"># As a small side note, the Financial Times (the newspaper that made this figure) uses ggplot2 to produce their figures and even have their own ggplot theme (ftplottools).</w:t>
       </w:r>
     </w:p>
     <w:bookmarkEnd w:id="100"/>
-    <w:bookmarkEnd w:id="101"/>
+    <w:bookmarkStart w:id="104" w:name="are-you-even-happy"/>
+    <w:p>
+      <w:pPr>
+        <w:pStyle w:val="Heading2"/>
+      </w:pPr>
+      <w:r>
+        <w:t xml:space="preserve">Are you even happy?</w:t>
+      </w:r>
+    </w:p>
+    <w:p>
+      <w:pPr>
+        <w:pStyle w:val="FirstParagraph"/>
+      </w:pPr>
+      <w:r>
+        <w:drawing>
+          <wp:inline>
+            <wp:extent cx="3810000" cy="3515054"/>
+            <wp:effectExtent b="0" l="0" r="0" t="0"/>
+            <wp:docPr descr="" title="" id="102" name="Picture"/>
+            <a:graphic>
+              <a:graphicData uri="http://schemas.openxmlformats.org/drawingml/2006/picture">
+                <pic:pic>
+                  <pic:nvPicPr>
+                    <pic:cNvPr descr="Figures/Happy.jpg" id="103" name="Picture"/>
+                    <pic:cNvPicPr>
+                      <a:picLocks noChangeArrowheads="1" noChangeAspect="1"/>
+                    </pic:cNvPicPr>
+                  </pic:nvPicPr>
+                  <pic:blipFill>
+                    <a:blip r:embed="rId101"/>
+                    <a:stretch>
+                      <a:fillRect/>
+                    </a:stretch>
+                  </pic:blipFill>
+                  <pic:spPr bwMode="auto">
+                    <a:xfrm>
+                      <a:off x="0" y="0"/>
+                      <a:ext cx="3810000" cy="3515054"/>
+                    </a:xfrm>
+                    <a:prstGeom prst="rect">
+                      <a:avLst/>
+                    </a:prstGeom>
+                    <a:noFill/>
+                    <a:ln w="9525">
+                      <a:noFill/>
+                      <a:headEnd/>
+                      <a:tailEnd/>
+                    </a:ln>
+                  </pic:spPr>
+                </pic:pic>
+              </a:graphicData>
+            </a:graphic>
+          </wp:inline>
+        </w:drawing>
+      </w:r>
+    </w:p>
+    <w:p>
+      <w:pPr>
+        <w:pStyle w:val="SourceCode"/>
+      </w:pPr>
+      <w:r>
+        <w:rPr>
+          <w:rStyle w:val="CommentTok"/>
+        </w:rPr>
+        <w:t xml:space="preserve"># Ok, so an obviously dumb figure. The bars here are just the order. So Finland is the "happiest" country in the world, ranked at 1, while New Zealand is the 10th happiest. At this point, the figure is an overly complicated and glorified list.</w:t>
+      </w:r>
+      <w:r>
+        <w:br/>
+      </w:r>
+      <w:r>
+        <w:br/>
+      </w:r>
+      <w:r>
+        <w:rPr>
+          <w:rStyle w:val="CommentTok"/>
+        </w:rPr>
+        <w:t xml:space="preserve"># More subtly, I'm always super sceptical of these kinds of "happiness" ratings and similar measurements. I have no idea how happy I am; am I a "10 happiness out of 10 potential happiness" today or am I feeling more like a 9.2 out of 10? Have I ever truly had a 0 out of 10? Would you and I give the same "happiness score" if we had the same "happiness"? Maybe I'm a nihilist and your 5/10 is my 10/10. What if I'm just having an off day and I'm pissed off but I'm normally super chirpy? How many people do you ask to figure out happiness? Five? A million?</w:t>
+      </w:r>
+      <w:r>
+        <w:br/>
+      </w:r>
+      <w:r>
+        <w:br/>
+      </w:r>
+      <w:r>
+        <w:rPr>
+          <w:rStyle w:val="CommentTok"/>
+        </w:rPr>
+        <w:t xml:space="preserve"># The point I'm making here is that the *data* underlying this figure is most likely nonsense. At least, it doesn't pass *my* assumption of validity check.</w:t>
+      </w:r>
+    </w:p>
+    <w:bookmarkEnd w:id="104"/>
+    <w:bookmarkStart w:id="108" w:name="birds-and-light"/>
+    <w:p>
+      <w:pPr>
+        <w:pStyle w:val="Heading2"/>
+      </w:pPr>
+      <w:r>
+        <w:t xml:space="preserve">Birds and light</w:t>
+      </w:r>
+    </w:p>
+    <w:p>
+      <w:pPr>
+        <w:pStyle w:val="FirstParagraph"/>
+      </w:pPr>
+      <w:r>
+        <w:drawing>
+          <wp:inline>
+            <wp:extent cx="4677877" cy="3869355"/>
+            <wp:effectExtent b="0" l="0" r="0" t="0"/>
+            <wp:docPr descr="" title="" id="106" name="Picture"/>
+            <a:graphic>
+              <a:graphicData uri="http://schemas.openxmlformats.org/drawingml/2006/picture">
+                <pic:pic>
+                  <pic:nvPicPr>
+                    <pic:cNvPr descr="Figures/Birds.png" id="107" name="Picture"/>
+                    <pic:cNvPicPr>
+                      <a:picLocks noChangeArrowheads="1" noChangeAspect="1"/>
+                    </pic:cNvPicPr>
+                  </pic:nvPicPr>
+                  <pic:blipFill>
+                    <a:blip r:embed="rId105"/>
+                    <a:stretch>
+                      <a:fillRect/>
+                    </a:stretch>
+                  </pic:blipFill>
+                  <pic:spPr bwMode="auto">
+                    <a:xfrm>
+                      <a:off x="0" y="0"/>
+                      <a:ext cx="4677877" cy="3869355"/>
+                    </a:xfrm>
+                    <a:prstGeom prst="rect">
+                      <a:avLst/>
+                    </a:prstGeom>
+                    <a:noFill/>
+                    <a:ln w="9525">
+                      <a:noFill/>
+                      <a:headEnd/>
+                      <a:tailEnd/>
+                    </a:ln>
+                  </pic:spPr>
+                </pic:pic>
+              </a:graphicData>
+            </a:graphic>
+          </wp:inline>
+        </w:drawing>
+      </w:r>
+    </w:p>
+    <w:p>
+      <w:pPr>
+        <w:pStyle w:val="SourceCode"/>
+      </w:pPr>
+      <w:r>
+        <w:rPr>
+          <w:rStyle w:val="CommentTok"/>
+        </w:rPr>
+        <w:t xml:space="preserve"># This comes from a paper published in Science (one of the most prestigious journals you can publish in) and it has some pretty poor choices from a data visualisation perspective.</w:t>
+      </w:r>
+      <w:r>
+        <w:br/>
+      </w:r>
+      <w:r>
+        <w:br/>
+      </w:r>
+      <w:r>
+        <w:rPr>
+          <w:rStyle w:val="CommentTok"/>
+        </w:rPr>
+        <w:t xml:space="preserve"># 1. Remember from the lecture that people really struggle to accurately interpret stacked bars. In this figure, can you tell if there is a difference in "Unfiltered detections" (the darker orange bars) in Aug 2023 and Sep 2023? I have no idea. I genuinely can't tell. Maybe? </w:t>
+      </w:r>
+      <w:r>
+        <w:br/>
+      </w:r>
+      <w:r>
+        <w:br/>
+      </w:r>
+      <w:r>
+        <w:rPr>
+          <w:rStyle w:val="CommentTok"/>
+        </w:rPr>
+        <w:t xml:space="preserve"># What about the bars labelled "Response variable"? I wouldn't blame you if you didn't even see notice this in the bars. </w:t>
+      </w:r>
+      <w:r>
+        <w:br/>
+      </w:r>
+      <w:r>
+        <w:br/>
+      </w:r>
+      <w:r>
+        <w:rPr>
+          <w:rStyle w:val="CommentTok"/>
+        </w:rPr>
+        <w:t xml:space="preserve"># Overall, the only thing I can really say about the data from this figure is that there was some sort of "trend" over time in observations. What's the point then? Why bother with the colours?</w:t>
+      </w:r>
+      <w:r>
+        <w:br/>
+      </w:r>
+      <w:r>
+        <w:br/>
+      </w:r>
+      <w:r>
+        <w:rPr>
+          <w:rStyle w:val="CommentTok"/>
+        </w:rPr>
+        <w:t xml:space="preserve"># 2. The colours probably aren't colour blind friendly. It costs nothing to make them friendly and takes seconds to change, so why risk it?</w:t>
+      </w:r>
+      <w:r>
+        <w:br/>
+      </w:r>
+      <w:r>
+        <w:br/>
+      </w:r>
+      <w:r>
+        <w:rPr>
+          <w:rStyle w:val="CommentTok"/>
+        </w:rPr>
+        <w:t xml:space="preserve"># 3. The x-axis is overly annotated. Why not just have the start, middle and end date shown? It's so cluttered right now that it's actually pretty hard to say which month each bin represents. I'm pretty sure I know the answer, and I think it's because the author had date as a factor in R, which means each month is printed out. (You can have "date" as a data type in R that would have fixed this).</w:t>
+      </w:r>
+      <w:r>
+        <w:br/>
+      </w:r>
+      <w:r>
+        <w:br/>
+      </w:r>
+      <w:r>
+        <w:rPr>
+          <w:rStyle w:val="CommentTok"/>
+        </w:rPr>
+        <w:t xml:space="preserve"># How I'd make this figure:</w:t>
+      </w:r>
+      <w:r>
+        <w:br/>
+      </w:r>
+      <w:r>
+        <w:rPr>
+          <w:rStyle w:val="CommentTok"/>
+        </w:rPr>
+        <w:t xml:space="preserve"># I'd use points showing the number of observations, with each "group" (i.e. "Response variable") connected by a line. I'd then split the figure into three smaller ones, one for each group. And in each of these smaller figures, the y-axis would have a different scale so that you could see the trend for Response variable.</w:t>
+      </w:r>
+    </w:p>
+    <w:bookmarkEnd w:id="108"/>
+    <w:bookmarkStart w:id="112" w:name="marmosets-and-ketamine"/>
+    <w:p>
+      <w:pPr>
+        <w:pStyle w:val="Heading2"/>
+      </w:pPr>
+      <w:r>
+        <w:t xml:space="preserve">Marmosets and ketamine (?!)</w:t>
+      </w:r>
+    </w:p>
+    <w:p>
+      <w:pPr>
+        <w:pStyle w:val="FirstParagraph"/>
+      </w:pPr>
+      <w:r>
+        <w:drawing>
+          <wp:inline>
+            <wp:extent cx="2300437" cy="2964581"/>
+            <wp:effectExtent b="0" l="0" r="0" t="0"/>
+            <wp:docPr descr="" title="" id="110" name="Picture"/>
+            <a:graphic>
+              <a:graphicData uri="http://schemas.openxmlformats.org/drawingml/2006/picture">
+                <pic:pic>
+                  <pic:nvPicPr>
+                    <pic:cNvPr descr="Figures/Ketamine.png" id="111" name="Picture"/>
+                    <pic:cNvPicPr>
+                      <a:picLocks noChangeArrowheads="1" noChangeAspect="1"/>
+                    </pic:cNvPicPr>
+                  </pic:nvPicPr>
+                  <pic:blipFill>
+                    <a:blip r:embed="rId109"/>
+                    <a:stretch>
+                      <a:fillRect/>
+                    </a:stretch>
+                  </pic:blipFill>
+                  <pic:spPr bwMode="auto">
+                    <a:xfrm>
+                      <a:off x="0" y="0"/>
+                      <a:ext cx="2300437" cy="2964581"/>
+                    </a:xfrm>
+                    <a:prstGeom prst="rect">
+                      <a:avLst/>
+                    </a:prstGeom>
+                    <a:noFill/>
+                    <a:ln w="9525">
+                      <a:noFill/>
+                      <a:headEnd/>
+                      <a:tailEnd/>
+                    </a:ln>
+                  </pic:spPr>
+                </pic:pic>
+              </a:graphicData>
+            </a:graphic>
+          </wp:inline>
+        </w:drawing>
+      </w:r>
+    </w:p>
+    <w:p>
+      <w:pPr>
+        <w:pStyle w:val="SourceCode"/>
+      </w:pPr>
+      <w:r>
+        <w:rPr>
+          <w:rStyle w:val="CommentTok"/>
+        </w:rPr>
+        <w:t xml:space="preserve"># This is another figure from Science from a study that was apparently looking at giving ketamine to marmosets (I have no idea why...) and it's vile.</w:t>
+      </w:r>
+      <w:r>
+        <w:br/>
+      </w:r>
+      <w:r>
+        <w:br/>
+      </w:r>
+      <w:r>
+        <w:rPr>
+          <w:rStyle w:val="CommentTok"/>
+        </w:rPr>
+        <w:t xml:space="preserve"># 1. The hell is with the weird 1990's colour/pattern theme?? Who was like - "Yeaaaaaah bruh, this looks siiiiiiick dude".</w:t>
+      </w:r>
+      <w:r>
+        <w:br/>
+      </w:r>
+      <w:r>
+        <w:br/>
+      </w:r>
+      <w:r>
+        <w:rPr>
+          <w:rStyle w:val="CommentTok"/>
+        </w:rPr>
+        <w:t xml:space="preserve"># 2. Abbreviations in figures are rarely a good idea. Great figures don't need a legend or a paper to make sense of. You can see them in complete isolation and they make total sense. Do you know what the "change in total response" is? What about "Sal/Veh"? Make it make sense...</w:t>
+      </w:r>
+      <w:r>
+        <w:br/>
+      </w:r>
+      <w:r>
+        <w:br/>
+      </w:r>
+      <w:r>
+        <w:rPr>
+          <w:rStyle w:val="CommentTok"/>
+        </w:rPr>
+        <w:t xml:space="preserve"># 3. All the randomly shaped points. What do they mean? Why are some filled and others empty? Are those all the observations they had, cause if so... what's that? Like 10 observations? Get outta here with that.</w:t>
+      </w:r>
+      <w:r>
+        <w:br/>
+      </w:r>
+      <w:r>
+        <w:br/>
+      </w:r>
+      <w:r>
+        <w:rPr>
+          <w:rStyle w:val="CommentTok"/>
+        </w:rPr>
+        <w:t xml:space="preserve"># 4. The bars are completely unnecessary here and probably misleading. What the authors are trying to show are specific values (called "point estimates"). For example, the category "Sal/DCZ" is estimated at roughly -50 on the y-axis. That's the value that's important. By using a bar you're implying there was also a -49, and -48, and -47, all the way to 0. That's not the case. It's -50. Just -50.</w:t>
+      </w:r>
+      <w:r>
+        <w:br/>
+      </w:r>
+      <w:r>
+        <w:br/>
+      </w:r>
+      <w:r>
+        <w:rPr>
+          <w:rStyle w:val="CommentTok"/>
+        </w:rPr>
+        <w:t xml:space="preserve"># How I'd make this figure</w:t>
+      </w:r>
+      <w:r>
+        <w:br/>
+      </w:r>
+      <w:r>
+        <w:rPr>
+          <w:rStyle w:val="CommentTok"/>
+        </w:rPr>
+        <w:t xml:space="preserve"># I'd use points for the estimated values instead of bars. I probably wouldn't add points to show the data, but if I did, I'd make those points much smaller (and be consistent). I'd write the full category name and rotate them 90 degrees so it would fit in. (I'd also get rid of the P-value "bars" and asterisk's (the *) at the top of the figure but I'll explain why later in the course).</w:t>
+      </w:r>
+    </w:p>
+    <w:bookmarkEnd w:id="112"/>
+    <w:bookmarkEnd w:id="113"/>
     <w:sectPr>
       <w:pgSz w:h="15840" w:w="12240"/>
       <w:pgMar w:bottom="1440" w:footer="720" w:gutter="0" w:header="720" w:left="1440" w:right="1440" w:top="1440"/>
@@ -12432,14 +12813,14 @@
     </w:lvl>
   </w:abstractNum>
   <w:abstractNum w:abstractNumId="990">
-    <w:nsid w:val="0000A990"/>
+    <w:nsid w:val="A990"/>
     <w:multiLevelType w:val="multilevel"/>
     <w:lvl w:ilvl="0">
       <w:numFmt w:val="bullet"/>
       <w:lvlText w:val=" "/>
       <w:lvlJc w:val="left"/>
       <w:pPr>
-        <w:ind w:left="720" w:hanging="360"/>
+        <w:ind w:left="720" w:hanging="480"/>
       </w:pPr>
     </w:lvl>
     <w:lvl w:ilvl="1">
@@ -12447,7 +12828,7 @@
       <w:lvlText w:val=" "/>
       <w:lvlJc w:val="left"/>
       <w:pPr>
-        <w:ind w:left="1440" w:hanging="360"/>
+        <w:ind w:left="1440" w:hanging="480"/>
       </w:pPr>
     </w:lvl>
     <w:lvl w:ilvl="2">
@@ -12455,7 +12836,7 @@
       <w:lvlText w:val=" "/>
       <w:lvlJc w:val="left"/>
       <w:pPr>
-        <w:ind w:left="2160" w:hanging="360"/>
+        <w:ind w:left="2160" w:hanging="480"/>
       </w:pPr>
     </w:lvl>
     <w:lvl w:ilvl="3">
@@ -12463,7 +12844,7 @@
       <w:lvlText w:val=" "/>
       <w:lvlJc w:val="left"/>
       <w:pPr>
-        <w:ind w:left="2880" w:hanging="360"/>
+        <w:ind w:left="2880" w:hanging="480"/>
       </w:pPr>
     </w:lvl>
     <w:lvl w:ilvl="4">
@@ -12471,7 +12852,7 @@
       <w:lvlText w:val=" "/>
       <w:lvlJc w:val="left"/>
       <w:pPr>
-        <w:ind w:left="3600" w:hanging="360"/>
+        <w:ind w:left="3600" w:hanging="480"/>
       </w:pPr>
     </w:lvl>
     <w:lvl w:ilvl="5">
@@ -12479,7 +12860,7 @@
       <w:lvlText w:val=" "/>
       <w:lvlJc w:val="left"/>
       <w:pPr>
-        <w:ind w:left="4320" w:hanging="360"/>
+        <w:ind w:left="4320" w:hanging="480"/>
       </w:pPr>
     </w:lvl>
     <w:lvl w:ilvl="6">
@@ -12487,7 +12868,7 @@
       <w:lvlText w:val=" "/>
       <w:lvlJc w:val="left"/>
       <w:pPr>
-        <w:ind w:left="5040" w:hanging="360"/>
+        <w:ind w:left="5040" w:hanging="480"/>
       </w:pPr>
     </w:lvl>
     <w:lvl w:ilvl="7">
@@ -12495,7 +12876,7 @@
       <w:lvlText w:val=" "/>
       <w:lvlJc w:val="left"/>
       <w:pPr>
-        <w:ind w:left="5760" w:hanging="360"/>
+        <w:ind w:left="5760" w:hanging="480"/>
       </w:pPr>
     </w:lvl>
     <w:lvl w:ilvl="8">
@@ -12503,12 +12884,12 @@
       <w:lvlText w:val=" "/>
       <w:lvlJc w:val="left"/>
       <w:pPr>
-        <w:ind w:left="6480" w:hanging="360"/>
+        <w:ind w:left="6480" w:hanging="480"/>
       </w:pPr>
     </w:lvl>
   </w:abstractNum>
   <w:abstractNum w:abstractNumId="99411">
-    <w:nsid w:val="00A99411"/>
+    <w:nsid w:val="A99411"/>
     <w:multiLevelType w:val="multilevel"/>
     <w:lvl w:ilvl="0">
       <w:start w:val="1"/>
@@ -12516,7 +12897,7 @@
       <w:lvlText w:val="%1."/>
       <w:lvlJc w:val="left"/>
       <w:pPr>
-        <w:ind w:left="720" w:hanging="360"/>
+        <w:ind w:left="720" w:hanging="480"/>
       </w:pPr>
     </w:lvl>
     <w:lvl w:ilvl="1">
@@ -12525,7 +12906,7 @@
       <w:lvlText w:val="%2."/>
       <w:lvlJc w:val="left"/>
       <w:pPr>
-        <w:ind w:left="1440" w:hanging="360"/>
+        <w:ind w:left="1440" w:hanging="480"/>
       </w:pPr>
     </w:lvl>
     <w:lvl w:ilvl="2">
@@ -12534,7 +12915,7 @@
       <w:lvlText w:val="%3."/>
       <w:lvlJc w:val="left"/>
       <w:pPr>
-        <w:ind w:left="2160" w:hanging="360"/>
+        <w:ind w:left="2160" w:hanging="480"/>
       </w:pPr>
     </w:lvl>
     <w:lvl w:ilvl="3">
@@ -12543,7 +12924,7 @@
       <w:lvlText w:val="%4."/>
       <w:lvlJc w:val="left"/>
       <w:pPr>
-        <w:ind w:left="2880" w:hanging="360"/>
+        <w:ind w:left="2880" w:hanging="480"/>
       </w:pPr>
     </w:lvl>
     <w:lvl w:ilvl="4">
@@ -12552,7 +12933,7 @@
       <w:lvlText w:val="%5."/>
       <w:lvlJc w:val="left"/>
       <w:pPr>
-        <w:ind w:left="3600" w:hanging="360"/>
+        <w:ind w:left="3600" w:hanging="480"/>
       </w:pPr>
     </w:lvl>
     <w:lvl w:ilvl="5">
@@ -12561,7 +12942,7 @@
       <w:lvlText w:val="%6."/>
       <w:lvlJc w:val="left"/>
       <w:pPr>
-        <w:ind w:left="4320" w:hanging="360"/>
+        <w:ind w:left="4320" w:hanging="480"/>
       </w:pPr>
     </w:lvl>
     <w:lvl w:ilvl="6">
@@ -12570,7 +12951,7 @@
       <w:lvlText w:val="%7."/>
       <w:lvlJc w:val="left"/>
       <w:pPr>
-        <w:ind w:left="5040" w:hanging="360"/>
+        <w:ind w:left="5040" w:hanging="480"/>
       </w:pPr>
     </w:lvl>
     <w:lvl w:ilvl="7">
@@ -12579,7 +12960,7 @@
       <w:lvlText w:val="%8."/>
       <w:lvlJc w:val="left"/>
       <w:pPr>
-        <w:ind w:left="5760" w:hanging="360"/>
+        <w:ind w:left="5760" w:hanging="480"/>
       </w:pPr>
     </w:lvl>
     <w:lvl w:ilvl="8">
@@ -12588,7 +12969,7 @@
       <w:lvlText w:val="%9."/>
       <w:lvlJc w:val="left"/>
       <w:pPr>
-        <w:ind w:left="6480" w:hanging="360"/>
+        <w:ind w:left="6480" w:hanging="480"/>
       </w:pPr>
     </w:lvl>
   </w:abstractNum>

</xml_diff>